<commit_message>
feat(festival): add program, body practices, and clickable details
</commit_message>
<xml_diff>
--- a/Фестиваль описание.docx
+++ b/Фестиваль описание.docx
@@ -47,7 +47,7 @@
     <w:p>
       <w:r>
         <w:pict w14:anchorId="34B359B7">
-          <v:rect id="_x0000_i1049" style="width:0;height:1.5pt" o:hralign="center" o:hrstd="t" o:hr="t" fillcolor="#a0a0a0" stroked="f"/>
+          <v:rect id="_x0000_i1025" style="width:0;height:1.5pt" o:hralign="center" o:hrstd="t" o:hr="t" fillcolor="#a0a0a0" stroked="f"/>
         </w:pict>
       </w:r>
     </w:p>
@@ -219,7 +219,7 @@
     <w:p>
       <w:r>
         <w:pict w14:anchorId="5F85A369">
-          <v:rect id="_x0000_i1050" style="width:0;height:1.5pt" o:hralign="center" o:hrstd="t" o:hr="t" fillcolor="#a0a0a0" stroked="f"/>
+          <v:rect id="_x0000_i1026" style="width:0;height:1.5pt" o:hralign="center" o:hrstd="t" o:hr="t" fillcolor="#a0a0a0" stroked="f"/>
         </w:pict>
       </w:r>
     </w:p>
@@ -716,7 +716,7 @@
     <w:p>
       <w:r>
         <w:pict w14:anchorId="24DADC7F">
-          <v:rect id="_x0000_i1051" style="width:0;height:1.5pt" o:hralign="center" o:hrstd="t" o:hr="t" fillcolor="#a0a0a0" stroked="f"/>
+          <v:rect id="_x0000_i1027" style="width:0;height:1.5pt" o:hralign="center" o:hrstd="t" o:hr="t" fillcolor="#a0a0a0" stroked="f"/>
         </w:pict>
       </w:r>
     </w:p>
@@ -806,7 +806,7 @@
     <w:p>
       <w:r>
         <w:pict w14:anchorId="7B49B672">
-          <v:rect id="_x0000_i1052" style="width:0;height:1.5pt" o:hralign="center" o:hrstd="t" o:hr="t" fillcolor="#a0a0a0" stroked="f"/>
+          <v:rect id="_x0000_i1028" style="width:0;height:1.5pt" o:hralign="center" o:hrstd="t" o:hr="t" fillcolor="#a0a0a0" stroked="f"/>
         </w:pict>
       </w:r>
     </w:p>
@@ -1663,10 +1663,7 @@
           </w:tcPr>
           <w:p>
             <w:r>
-              <w:t>Рекламные публикации в соцсетях</w:t>
-            </w:r>
-            <w:r>
-              <w:t xml:space="preserve"> </w:t>
+              <w:t xml:space="preserve">Рекламные публикации в соцсетях </w:t>
             </w:r>
           </w:p>
         </w:tc>
@@ -2208,6 +2205,60 @@
       <w:proofErr w:type="spellEnd"/>
       <w:r>
         <w:t xml:space="preserve"> на полгода вперед и создавая доверие через интервью и личный контакт.</w:t>
+      </w:r>
+    </w:p>
+    <w:p>
+      <w:pPr>
+        <w:pStyle w:val="a7"/>
+        <w:rPr>
+          <w:b/>
+          <w:bCs/>
+        </w:rPr>
+      </w:pPr>
+    </w:p>
+    <w:p>
+      <w:pPr>
+        <w:pStyle w:val="a7"/>
+        <w:rPr>
+          <w:b/>
+          <w:bCs/>
+        </w:rPr>
+      </w:pPr>
+    </w:p>
+    <w:p>
+      <w:pPr>
+        <w:pStyle w:val="a7"/>
+        <w:rPr>
+          <w:b/>
+          <w:bCs/>
+        </w:rPr>
+      </w:pPr>
+      <w:r>
+        <w:rPr>
+          <w:rFonts w:ascii="Segoe UI Symbol" w:hAnsi="Segoe UI Symbol" w:cs="Segoe UI Symbol"/>
+          <w:b/>
+          <w:bCs/>
+        </w:rPr>
+        <w:t>🏛</w:t>
+      </w:r>
+      <w:r>
+        <w:rPr>
+          <w:b/>
+          <w:bCs/>
+        </w:rPr>
+        <w:t xml:space="preserve"> О месте: Пространство АТС</w:t>
+      </w:r>
+    </w:p>
+    <w:p>
+      <w:pPr>
+        <w:pStyle w:val="a7"/>
+        <w:numPr>
+          <w:ilvl w:val="0"/>
+          <w:numId w:val="6"/>
+        </w:numPr>
+      </w:pPr>
+      <w:r>
+        <w:t>Выбор АТС как площадки символичен: это место, где десятилетиями соединялись линии связи. На один день мы превратим его в центр коммуникации смыслов, технологий и психологии. Индустриальная архитектура подчеркивает фундаментальность наших методов и готовность к «высоковольтному» масштабу.</w:t>
       </w:r>
     </w:p>
     <w:p/>
@@ -3705,6 +3756,7 @@
   <w:style w:type="character" w:default="1" w:styleId="a0">
     <w:name w:val="Default Paragraph Font"/>
     <w:uiPriority w:val="1"/>
+    <w:semiHidden/>
     <w:unhideWhenUsed/>
   </w:style>
   <w:style w:type="table" w:default="1" w:styleId="a1">

</xml_diff>